<commit_message>
docs(platform): define platform data constitution v1.0
- define object ownership
- define studio responsibilities
- establish platform object map
- document authoring constitution
- prepare implementation baseline for PDM-02

Co-authored-by: Cursor <cursoragent@cursor.com>
</commit_message>
<xml_diff>
--- a/docs/ssot/PLATFORM ROADMAP.docx
+++ b/docs/ssot/PLATFORM ROADMAP.docx
@@ -347,6 +347,38 @@
           <w:p>
             <w:r>
               <w:t>Další rozvoj řízen validací</w:t>
+            </w:r>
+          </w:p>
+        </w:tc>
+      </w:tr>
+      <w:tr>
+        <w:tc>
+          <w:tcPr>
+            <w:tcW w:type="dxa" w:w="3249"/>
+          </w:tcPr>
+          <w:p>
+            <w:r>
+              <w:t>PDM-01 Platform Data Constitution v1.0</w:t>
+            </w:r>
+          </w:p>
+        </w:tc>
+        <w:tc>
+          <w:tcPr>
+            <w:tcW w:type="dxa" w:w="3249"/>
+          </w:tcPr>
+          <w:p>
+            <w:r>
+              <w:t>Completed</w:t>
+            </w:r>
+          </w:p>
+        </w:tc>
+        <w:tc>
+          <w:tcPr>
+            <w:tcW w:type="dxa" w:w="3249"/>
+          </w:tcPr>
+          <w:p>
+            <w:r>
+              <w:t>Ústava datové architektury · Authoring · Studio matrix · Object map</w:t>
             </w:r>
           </w:p>
         </w:tc>
@@ -1230,6 +1262,90 @@
           </w:p>
         </w:tc>
       </w:tr>
+      <w:tr>
+        <w:tc>
+          <w:tcPr>
+            <w:tcW w:type="dxa" w:w="2436"/>
+          </w:tcPr>
+          <w:p>
+            <w:r>
+              <w:t>PDM-01</w:t>
+            </w:r>
+          </w:p>
+        </w:tc>
+        <w:tc>
+          <w:tcPr>
+            <w:tcW w:type="dxa" w:w="2436"/>
+          </w:tcPr>
+          <w:p>
+            <w:r>
+              <w:t>Platform Data Constitution</w:t>
+            </w:r>
+          </w:p>
+        </w:tc>
+        <w:tc>
+          <w:tcPr>
+            <w:tcW w:type="dxa" w:w="2436"/>
+          </w:tcPr>
+          <w:p>
+            <w:r>
+              <w:t>docs</w:t>
+            </w:r>
+          </w:p>
+        </w:tc>
+        <w:tc>
+          <w:tcPr>
+            <w:tcW w:type="dxa" w:w="2436"/>
+          </w:tcPr>
+          <w:p>
+            <w:r>
+              <w:t>Completed</w:t>
+            </w:r>
+          </w:p>
+        </w:tc>
+      </w:tr>
+      <w:tr>
+        <w:tc>
+          <w:tcPr>
+            <w:tcW w:type="dxa" w:w="2436"/>
+          </w:tcPr>
+          <w:p>
+            <w:r>
+              <w:t>PDM-02</w:t>
+            </w:r>
+          </w:p>
+        </w:tc>
+        <w:tc>
+          <w:tcPr>
+            <w:tcW w:type="dxa" w:w="2436"/>
+          </w:tcPr>
+          <w:p>
+            <w:r>
+              <w:t>Shared Project Runtime</w:t>
+            </w:r>
+          </w:p>
+        </w:tc>
+        <w:tc>
+          <w:tcPr>
+            <w:tcW w:type="dxa" w:w="2436"/>
+          </w:tcPr>
+          <w:p>
+            <w:r>
+              <w:t>—</w:t>
+            </w:r>
+          </w:p>
+        </w:tc>
+        <w:tc>
+          <w:tcPr>
+            <w:tcW w:type="dxa" w:w="2436"/>
+          </w:tcPr>
+          <w:p>
+            <w:r>
+              <w:t>In progress</w:t>
+            </w:r>
+          </w:p>
+        </w:tc>
+      </w:tr>
     </w:tbl>
     <w:p/>
     <w:p>
@@ -1614,6 +1730,11 @@
         <w:t>Referenční dokumentace: docs/architecture/office/OFFICE-ROADMAP-v2.0.md</w:t>
       </w:r>
     </w:p>
+    <w:p>
+      <w:r>
+        <w:t>PDM-01 Completed (2026-08-05): Platform Data Constitution v1.0 approved. Canonical: Office owns obchodní proces, not nabídka content (Builder templates + project data). Next: PDM-02 Shared Project Runtime.</w:t>
+      </w:r>
+    </w:p>
     <w:sectPr>
       <w:pgSz w:w="12240" w:h="15840"/>
       <w:pgMar w:top="1247" w:right="1247" w:bottom="1247" w:left="1247" w:header="720" w:footer="720" w:gutter="0"/>

</xml_diff>

<commit_message>
refactor(platform): introduce shared project runtime
- introduce shared project runtime
- make Builder the single project author
- connect Office, Client, Manager and Sales to shared project repository
- remove duplicated project registries
- preserve runtime compatibility

Co-authored-by: Cursor <cursoragent@cursor.com>
</commit_message>
<xml_diff>
--- a/docs/ssot/PLATFORM ROADMAP.docx
+++ b/docs/ssot/PLATFORM ROADMAP.docx
@@ -379,6 +379,70 @@
           <w:p>
             <w:r>
               <w:t>Ústava datové architektury · Authoring · Studio matrix · Object map</w:t>
+            </w:r>
+          </w:p>
+        </w:tc>
+      </w:tr>
+      <w:tr>
+        <w:tc>
+          <w:tcPr>
+            <w:tcW w:type="dxa" w:w="3249"/>
+          </w:tcPr>
+          <w:p>
+            <w:r>
+              <w:t>PDM-02 Shared Project Runtime</w:t>
+            </w:r>
+          </w:p>
+        </w:tc>
+        <w:tc>
+          <w:tcPr>
+            <w:tcW w:type="dxa" w:w="3249"/>
+          </w:tcPr>
+          <w:p>
+            <w:r>
+              <w:t>Completed</w:t>
+            </w:r>
+          </w:p>
+        </w:tc>
+        <w:tc>
+          <w:tcPr>
+            <w:tcW w:type="dxa" w:w="3249"/>
+          </w:tcPr>
+          <w:p>
+            <w:r>
+              <w:t>Shared Project Runtime · Builder sole author · Studios on projectId</w:t>
+            </w:r>
+          </w:p>
+        </w:tc>
+      </w:tr>
+      <w:tr>
+        <w:tc>
+          <w:tcPr>
+            <w:tcW w:type="dxa" w:w="3249"/>
+          </w:tcPr>
+          <w:p>
+            <w:r>
+              <w:t>PDM-03 Studio Integration</w:t>
+            </w:r>
+          </w:p>
+        </w:tc>
+        <w:tc>
+          <w:tcPr>
+            <w:tcW w:type="dxa" w:w="3249"/>
+          </w:tcPr>
+          <w:p>
+            <w:r>
+              <w:t>In progress</w:t>
+            </w:r>
+          </w:p>
+        </w:tc>
+        <w:tc>
+          <w:tcPr>
+            <w:tcW w:type="dxa" w:w="3249"/>
+          </w:tcPr>
+          <w:p>
+            <w:r>
+              <w:t>Studio Integration · retire REFERENCE_HOUSE_PACKAGE binds</w:t>
             </w:r>
           </w:p>
         </w:tc>
@@ -1341,6 +1405,48 @@
           </w:tcPr>
           <w:p>
             <w:r>
+              <w:t>Completed</w:t>
+            </w:r>
+          </w:p>
+        </w:tc>
+      </w:tr>
+      <w:tr>
+        <w:tc>
+          <w:tcPr>
+            <w:tcW w:type="dxa" w:w="2436"/>
+          </w:tcPr>
+          <w:p>
+            <w:r>
+              <w:t>PDM-03</w:t>
+            </w:r>
+          </w:p>
+        </w:tc>
+        <w:tc>
+          <w:tcPr>
+            <w:tcW w:type="dxa" w:w="2436"/>
+          </w:tcPr>
+          <w:p>
+            <w:r>
+              <w:t>Studio Integration</w:t>
+            </w:r>
+          </w:p>
+        </w:tc>
+        <w:tc>
+          <w:tcPr>
+            <w:tcW w:type="dxa" w:w="2436"/>
+          </w:tcPr>
+          <w:p>
+            <w:r>
+              <w:t>—</w:t>
+            </w:r>
+          </w:p>
+        </w:tc>
+        <w:tc>
+          <w:tcPr>
+            <w:tcW w:type="dxa" w:w="2436"/>
+          </w:tcPr>
+          <w:p>
+            <w:r>
               <w:t>In progress</w:t>
             </w:r>
           </w:p>
@@ -1735,6 +1841,11 @@
         <w:t>PDM-01 Completed (2026-08-05): Platform Data Constitution v1.0 approved. Canonical: Office owns obchodní proces, not nabídka content (Builder templates + project data). Next: PDM-02 Shared Project Runtime.</w:t>
       </w:r>
     </w:p>
+    <w:p>
+      <w:r>
+        <w:t>PDM-02 Completed (2026-08-05): Shared Project Runtime. Next: PDM-03 Studio Integration (Manager HP bind + retire reference/demo paths).</w:t>
+      </w:r>
+    </w:p>
     <w:sectPr>
       <w:pgSz w:w="12240" w:h="15840"/>
       <w:pgMar w:top="1247" w:right="1247" w:bottom="1247" w:left="1247" w:header="720" w:footer="720" w:gutter="0"/>

</xml_diff>